<commit_message>
Add Phục Hình RHM K44 and recover K43 câu 52
The K44 page in the compiled scan is over-sharpened and unreadable, so
K44 is transcribed from a clean photo of the same exam paper (checked
page by page against the damaged scan). The exam has no marks, so every
answer is chosen from the PHTL textbook. K43 câu 52 is rebuilt from what
is still legible; câu 51 stays out.

An exam can now carry a "# Ghi chú (label): text" header: the label shows
before the exam name in the library and the quiz title, the full text on
hover and at the top of the Word file. Figures can also be cropped from a
page of a separate PDF.

Co-Authored-By: Claude Opus 5.5 <noreply@anthropic.com>
</commit_message>
<xml_diff>
--- a/Đề thi Phục Hình Tháo Lắp RHM/RHM K43.docx
+++ b/Đề thi Phục Hình Tháo Lắp RHM/RHM K43.docx
@@ -16,7 +16,7 @@
         <w:rPr>
           <w:i/>
         </w:rPr>
-        <w:t>Phục hình I · Đề 100 · Lần 1 · Ngày thi 31/12/2020 · 60 câu (bỏ câu 51, 52 vì bản scan nhòe) · 35 phút</w:t>
+        <w:t>Phục hình I · Đề 100 · Lần 1 · Ngày thi 31/12/2020 · 60 câu (bỏ câu 51 vì bản scan nhòe; câu 52 dựng lại từ phần còn đọc được) · 35 phút</w:t>
       </w:r>
     </w:p>
     <w:p>
@@ -4422,6 +4422,107 @@
           <w:b/>
         </w:rPr>
         <w:t>Đáp án: A</w:t>
+      </w:r>
+    </w:p>
+    <w:p>
+      <w:pPr>
+        <w:keepNext/>
+        <w:spacing w:before="140"/>
+      </w:pPr>
+      <w:r>
+        <w:rPr>
+          <w:b/>
+        </w:rPr>
+        <w:t xml:space="preserve">Câu 52. </w:t>
+      </w:r>
+      <w:r>
+        <w:t>Trường hợp mất hết các răng sau, gối sáp được vát bao nhiêu độ tại vùng răng 7 để tránh vướng khi cắn?</w:t>
+      </w:r>
+    </w:p>
+    <w:p>
+      <w:pPr>
+        <w:ind w:left="259"/>
+      </w:pPr>
+      <w:r>
+        <w:rPr>
+          <w:b/>
+        </w:rPr>
+        <w:t xml:space="preserve">A. </w:t>
+      </w:r>
+      <w:r>
+        <w:t>30 độ</w:t>
+      </w:r>
+    </w:p>
+    <w:p>
+      <w:pPr>
+        <w:ind w:left="259"/>
+      </w:pPr>
+      <w:r>
+        <w:rPr>
+          <w:b/>
+        </w:rPr>
+        <w:t xml:space="preserve">B. </w:t>
+      </w:r>
+      <w:r>
+        <w:t>45 độ</w:t>
+      </w:r>
+    </w:p>
+    <w:p>
+      <w:pPr>
+        <w:ind w:left="259"/>
+      </w:pPr>
+      <w:r>
+        <w:rPr>
+          <w:b/>
+        </w:rPr>
+        <w:t xml:space="preserve">C. </w:t>
+      </w:r>
+      <w:r>
+        <w:t>60 độ</w:t>
+      </w:r>
+    </w:p>
+    <w:p>
+      <w:pPr>
+        <w:ind w:left="259"/>
+      </w:pPr>
+      <w:r>
+        <w:rPr>
+          <w:b/>
+        </w:rPr>
+        <w:t xml:space="preserve">D. </w:t>
+      </w:r>
+      <w:r>
+        <w:t>90 độ</w:t>
+      </w:r>
+    </w:p>
+    <w:p>
+      <w:r>
+        <w:rPr>
+          <w:b/>
+        </w:rPr>
+        <w:t>Đáp án: B</w:t>
+      </w:r>
+    </w:p>
+    <w:p>
+      <w:r>
+        <w:rPr>
+          <w:b/>
+        </w:rPr>
+        <w:t xml:space="preserve">Giải thích: </w:t>
+      </w:r>
+      <w:r>
+        <w:t>Theo giáo trình, gối sáp là khối sáp gắn liền vào nền tạm ở vị trí khoảng mất răng, hoặc gắn vào khung sườn ở phần yên kim loại. Gối sáp dùng để ghi tương quan hai hàm và là nơi sắp các răng giả thay cho các răng đã mất. Đặc điểm của gối sáp: đặt ngay trên đỉnh sống hàm; cao hơn các răng còn lại khoảng 1–1,5 mm; rộng hơn các răng còn lại 1–1,5 mm (khoảng 6 mm ở vùng răng trước và 8 mm ở vùng răng sau); chiều dài vừa chạm răng thật ở đầu khoảng mất răng. Riêng trường hợp mất hết các răng sau, gối sáp chỉ làm đến vùng răng cối lớn thứ nhất (răng 6) và được vát một góc 45° tại vùng răng cối lớn thứ hai (răng 7) để tránh vướng khi cắn. Gối sáp cũng không được nằm trên lồi cùng và gối hậu nha. Vì vậy góc vát tại vùng răng 7 là “45 độ”. (Giáo trình PHTL, Bài 5, mục 4.2 Gối sáp, tr. 57)</w:t>
+      </w:r>
+    </w:p>
+    <w:p>
+      <w:r>
+        <w:rPr>
+          <w:b/>
+        </w:rPr>
+        <w:t xml:space="preserve">Ghi chú bản scan: </w:t>
+      </w:r>
+      <w:r>
+        <w:t>Vùng câu này trên bản scan bị nhòe: cụm “sau, gối sáp” cuối dòng đầu không đọc được, được điền theo giáo trình và đề RHM K45 (câu 34); số “7” và bốn phương án vẫn đọc được. Đề gốc gạch chéo phương án “45 độ”. Đề RHM K45 (câu 34) có cùng câu hỏi và chọn đáp án này.</w:t>
       </w:r>
     </w:p>
     <w:p>

</xml_diff>